<commit_message>
chain of thought prompting+other enhancements
</commit_message>
<xml_diff>
--- a/capstone/Capstone_Project-CS[ID]/Codebase/output/cv_John_Doe.docx
+++ b/capstone/Capstone_Project-CS[ID]/Codebase/output/cv_John_Doe.docx
@@ -4,160 +4,901 @@
   <w:body>
     <w:p>
       <w:pPr>
-        <w:pStyle w:val="Title"/>
+        <w:spacing w:after="160"/>
         <w:jc w:val="center"/>
       </w:pPr>
       <w:r>
+        <w:rPr>
+          <w:b/>
+          <w:color w:val="1A237E"/>
+          <w:sz w:val="56"/>
+        </w:rPr>
         <w:t>John Doe</w:t>
       </w:r>
     </w:p>
     <w:p>
       <w:pPr>
-        <w:pStyle w:val="Heading1"/>
         <w:spacing w:before="240" w:after="120"/>
       </w:pPr>
       <w:r>
-        <w:t>Personal Information</w:t>
+        <w:rPr>
+          <w:b/>
+          <w:color w:val="1A237E"/>
+          <w:sz w:val="24"/>
+        </w:rPr>
+        <w:t>PERSONAL INFORMATION</w:t>
       </w:r>
     </w:p>
     <w:p>
       <w:pPr>
-        <w:spacing w:after="120"/>
+        <w:spacing w:after="160"/>
+        <w:jc w:val="left"/>
       </w:pPr>
       <w:r>
-        <w:t>- Education - name - ethnicity - nationality - occupation</w:t>
+        <w:rPr>
+          <w:color w:val="1A237E"/>
+          <w:sz w:val="18"/>
+        </w:rPr>
+        <w:t>__________________________________________________</w:t>
+      </w:r>
+    </w:p>
+    <w:p>
+      <w:pPr>
+        <w:spacing w:after="100"/>
+        <w:ind w:left="144"/>
+      </w:pPr>
+      <w:r>
+        <w:rPr>
+          <w:color w:val="2C3E50"/>
+          <w:sz w:val="22"/>
+        </w:rPr>
+        <w:t>John Doe</w:t>
+      </w:r>
+    </w:p>
+    <w:p>
+      <w:pPr>
+        <w:spacing w:after="100"/>
+        <w:ind w:left="144"/>
+      </w:pPr>
+      <w:r>
+        <w:rPr>
+          <w:color w:val="2C3E50"/>
+          <w:sz w:val="22"/>
+        </w:rPr>
+        <w:t>john.doe@email.com</w:t>
+      </w:r>
+    </w:p>
+    <w:p>
+      <w:pPr>
+        <w:spacing w:after="100"/>
+        <w:ind w:left="144"/>
+      </w:pPr>
+      <w:r>
+        <w:rPr>
+          <w:color w:val="2C3E50"/>
+          <w:sz w:val="22"/>
+        </w:rPr>
+        <w:t>+1-555-123-4567</w:t>
+      </w:r>
+    </w:p>
+    <w:p>
+      <w:pPr>
+        <w:spacing w:after="100"/>
+        <w:ind w:left="144"/>
+      </w:pPr>
+      <w:r>
+        <w:rPr>
+          <w:color w:val="2C3E50"/>
+          <w:sz w:val="22"/>
+        </w:rPr>
+        <w:t>[LinkedIn URL if provided]</w:t>
+      </w:r>
+    </w:p>
+    <w:p>
+      <w:pPr>
+        <w:spacing w:after="100"/>
+        <w:ind w:left="144"/>
+      </w:pPr>
+      <w:r>
+        <w:rPr>
+          <w:color w:val="2C3E50"/>
+          <w:sz w:val="22"/>
+        </w:rPr>
+        <w:t>[Address if provided]</w:t>
       </w:r>
     </w:p>
     <w:p/>
     <w:p>
       <w:pPr>
-        <w:pStyle w:val="Heading1"/>
         <w:spacing w:before="240" w:after="120"/>
       </w:pPr>
       <w:r>
-        <w:t>Professional Summary</w:t>
+        <w:rPr>
+          <w:b/>
+          <w:color w:val="1A237E"/>
+          <w:sz w:val="24"/>
+        </w:rPr>
+        <w:t>PROFESSIONAL SUMMARY</w:t>
       </w:r>
     </w:p>
     <w:p>
       <w:pPr>
-        <w:spacing w:after="120"/>
+        <w:spacing w:after="160"/>
+        <w:jc w:val="left"/>
       </w:pPr>
       <w:r>
-        <w:t>Samrat Nayak is a highly successful executive with a proven track record in managing successful organizations, including the following:</w:t>
+        <w:rPr>
+          <w:color w:val="1A237E"/>
+          <w:sz w:val="18"/>
+        </w:rPr>
+        <w:t>__________________________________________________</w:t>
+      </w:r>
+    </w:p>
+    <w:p>
+      <w:pPr>
+        <w:spacing w:after="100"/>
+        <w:ind w:left="144"/>
+      </w:pPr>
+      <w:r>
+        <w:rPr>
+          <w:color w:val="2C3E50"/>
+          <w:sz w:val="22"/>
+        </w:rPr>
+        <w:t>Experienced and results-driven professional with over 10 years in IT project management. Specializes in leading cross-functional teams to deliver complex projects on time and within budget. Strong analytical skills, proficient in Agile methodologies, and adept at navigating diverse technological landscapes. Seeking a challenging role that offers growth opportunities and allows me to leverage my expertise in streamlining operations and enhancing business outcomes. Contact: [john.doe@email.com](mailto:john.doe@email.com), +1-555-123-4567.</w:t>
       </w:r>
     </w:p>
     <w:p/>
     <w:p>
       <w:pPr>
-        <w:pStyle w:val="Heading1"/>
         <w:spacing w:before="240" w:after="120"/>
       </w:pPr>
       <w:r>
-        <w:t>Work Experience</w:t>
+        <w:rPr>
+          <w:b/>
+          <w:color w:val="1A237E"/>
+          <w:sz w:val="24"/>
+        </w:rPr>
+        <w:t>WORK EXPERIENCE</w:t>
       </w:r>
     </w:p>
     <w:p>
       <w:pPr>
-        <w:spacing w:after="120"/>
+        <w:spacing w:after="160"/>
+        <w:jc w:val="left"/>
       </w:pPr>
       <w:r>
-        <w:t>Work Experience:</w:t>
+        <w:rPr>
+          <w:color w:val="1A237E"/>
+          <w:sz w:val="18"/>
+        </w:rPr>
+        <w:t>__________________________________________________</w:t>
+      </w:r>
+    </w:p>
+    <w:p>
+      <w:pPr>
+        <w:spacing w:after="40"/>
+      </w:pPr>
+      <w:r>
+        <w:rPr>
+          <w:b/>
+          <w:color w:val="1A237E"/>
+          <w:sz w:val="22"/>
+        </w:rPr>
+        <w:t>1. Senior Software Engineer</w:t>
+      </w:r>
+    </w:p>
+    <w:p>
+      <w:pPr>
+        <w:spacing w:after="40"/>
+      </w:pPr>
+      <w:r>
+        <w:rPr>
+          <w:b/>
+          <w:color w:val="34495E"/>
+          <w:sz w:val="20"/>
+        </w:rPr>
+        <w:t>TechCorp</w:t>
+      </w:r>
+    </w:p>
+    <w:p>
+      <w:pPr>
+        <w:spacing w:after="60"/>
+      </w:pPr>
+      <w:r>
+        <w:rPr>
+          <w:b/>
+          <w:i/>
+          <w:color w:val="34495E"/>
+          <w:sz w:val="20"/>
+        </w:rPr>
+        <w:t>MM/YYYY – Present</w:t>
+      </w:r>
+    </w:p>
+    <w:p>
+      <w:pPr>
+        <w:pStyle w:val="ListBullet"/>
+        <w:spacing w:after="60"/>
+        <w:ind w:left="360" w:hanging="360"/>
+      </w:pPr>
+      <w:r>
+        <w:rPr>
+          <w:color w:val="2C3E50"/>
+          <w:sz w:val="20"/>
+        </w:rPr>
+        <w:t>Led a team of 8 engineers to develop and deploy a scalable, high-performance web application used by 50k+ users daily.</w:t>
+      </w:r>
+    </w:p>
+    <w:p>
+      <w:pPr>
+        <w:pStyle w:val="ListBullet"/>
+        <w:spacing w:after="60"/>
+        <w:ind w:left="360" w:hanging="360"/>
+      </w:pPr>
+      <w:r>
+        <w:rPr>
+          <w:color w:val="2C3E50"/>
+          <w:sz w:val="20"/>
+        </w:rPr>
+        <w:t>Implemented microservices architecture improving system efficiency by 30%.</w:t>
+      </w:r>
+    </w:p>
+    <w:p>
+      <w:pPr>
+        <w:pStyle w:val="ListBullet"/>
+        <w:spacing w:after="60"/>
+        <w:ind w:left="360" w:hanging="360"/>
+      </w:pPr>
+      <w:r>
+        <w:rPr>
+          <w:color w:val="2C3E50"/>
+          <w:sz w:val="20"/>
+        </w:rPr>
+        <w:t>Reduced code defects by 25% through rigorous code reviews and testing practices.</w:t>
+      </w:r>
+    </w:p>
+    <w:p>
+      <w:pPr>
+        <w:spacing w:after="80"/>
+      </w:pPr>
+    </w:p>
+    <w:p>
+      <w:pPr>
+        <w:spacing w:after="40"/>
+      </w:pPr>
+      <w:r>
+        <w:rPr>
+          <w:b/>
+          <w:color w:val="1A237E"/>
+          <w:sz w:val="22"/>
+        </w:rPr>
+        <w:t>2. Full Stack Developer</w:t>
+      </w:r>
+    </w:p>
+    <w:p>
+      <w:pPr>
+        <w:spacing w:after="40"/>
+      </w:pPr>
+      <w:r>
+        <w:rPr>
+          <w:b/>
+          <w:color w:val="34495E"/>
+          <w:sz w:val="20"/>
+        </w:rPr>
+        <w:t>WebTech</w:t>
+      </w:r>
+    </w:p>
+    <w:p>
+      <w:pPr>
+        <w:pStyle w:val="ListBullet"/>
+        <w:spacing w:after="60"/>
+        <w:ind w:left="360" w:hanging="360"/>
+      </w:pPr>
+      <w:r>
+        <w:rPr>
+          <w:color w:val="2C3E50"/>
+          <w:sz w:val="20"/>
+        </w:rPr>
+        <w:t>Developed and maintained web applications for clients in various industries, resulting in a 40% increase in customer satisfaction ratings.</w:t>
+      </w:r>
+    </w:p>
+    <w:p>
+      <w:pPr>
+        <w:pStyle w:val="ListBullet"/>
+        <w:spacing w:after="60"/>
+        <w:ind w:left="360" w:hanging="360"/>
+      </w:pPr>
+      <w:r>
+        <w:rPr>
+          <w:color w:val="2C3E50"/>
+          <w:sz w:val="20"/>
+        </w:rPr>
+        <w:t>Spearheaded the migration of legacy systems to modern technology stack, reducing maintenance costs by 25%.</w:t>
+      </w:r>
+    </w:p>
+    <w:p>
+      <w:pPr>
+        <w:pStyle w:val="ListBullet"/>
+        <w:spacing w:after="60"/>
+        <w:ind w:left="360" w:hanging="360"/>
+      </w:pPr>
+      <w:r>
+        <w:rPr>
+          <w:color w:val="2C3E50"/>
+          <w:sz w:val="20"/>
+        </w:rPr>
+        <w:t>Collaborated with UX/UI designers to create intuitive interfaces for mobile and web applications.</w:t>
+      </w:r>
+    </w:p>
+    <w:p>
+      <w:pPr>
+        <w:spacing w:after="80"/>
+      </w:pPr>
+    </w:p>
+    <w:p>
+      <w:pPr>
+        <w:spacing w:after="40"/>
+      </w:pPr>
+      <w:r>
+        <w:rPr>
+          <w:b/>
+          <w:color w:val="1A237E"/>
+          <w:sz w:val="22"/>
+        </w:rPr>
+        <w:t>3. Web Developer Intern</w:t>
+      </w:r>
+    </w:p>
+    <w:p>
+      <w:pPr>
+        <w:spacing w:after="40"/>
+      </w:pPr>
+      <w:r>
+        <w:rPr>
+          <w:b/>
+          <w:color w:val="34495E"/>
+          <w:sz w:val="20"/>
+        </w:rPr>
+        <w:t>IT Solutions</w:t>
+      </w:r>
+    </w:p>
+    <w:p>
+      <w:pPr>
+        <w:pStyle w:val="ListBullet"/>
+        <w:spacing w:after="60"/>
+        <w:ind w:left="360" w:hanging="360"/>
+      </w:pPr>
+      <w:r>
+        <w:rPr>
+          <w:color w:val="2C3E50"/>
+          <w:sz w:val="20"/>
+        </w:rPr>
+        <w:t>Designed and developed responsive web pages using HTML, CSS, and JavaScript.</w:t>
+      </w:r>
+    </w:p>
+    <w:p>
+      <w:pPr>
+        <w:pStyle w:val="ListBullet"/>
+        <w:spacing w:after="60"/>
+        <w:ind w:left="360" w:hanging="360"/>
+      </w:pPr>
+      <w:r>
+        <w:rPr>
+          <w:color w:val="2C3E50"/>
+          <w:sz w:val="20"/>
+        </w:rPr>
+        <w:t>Assisted in the creation of database schemas for new projects, improving data organization and retrieval efficiency by 15%.</w:t>
+      </w:r>
+    </w:p>
+    <w:p>
+      <w:pPr>
+        <w:spacing w:after="80"/>
+      </w:pPr>
+    </w:p>
+    <w:p/>
+    <w:p>
+      <w:pPr>
+        <w:spacing w:before="240" w:after="120"/>
+      </w:pPr>
+      <w:r>
+        <w:rPr>
+          <w:b/>
+          <w:color w:val="1A237E"/>
+          <w:sz w:val="24"/>
+        </w:rPr>
+        <w:t>EDUCATION</w:t>
+      </w:r>
+    </w:p>
+    <w:p>
+      <w:pPr>
+        <w:spacing w:after="160"/>
+        <w:jc w:val="left"/>
+      </w:pPr>
+      <w:r>
+        <w:rPr>
+          <w:color w:val="1A237E"/>
+          <w:sz w:val="18"/>
+        </w:rPr>
+        <w:t>__________________________________________________</w:t>
+      </w:r>
+    </w:p>
+    <w:p>
+      <w:pPr>
+        <w:spacing w:after="100"/>
+        <w:ind w:left="144"/>
+      </w:pPr>
+      <w:r>
+        <w:rPr>
+          <w:color w:val="2C3E50"/>
+          <w:sz w:val="22"/>
+        </w:rPr>
+        <w:t>1. Master of Science in Computer Science, Massachusetts Institute of Technology (MIT), 2018</w:t>
+      </w:r>
+    </w:p>
+    <w:p>
+      <w:pPr>
+        <w:spacing w:after="100"/>
+        <w:ind w:left="144"/>
+      </w:pPr>
+      <w:r>
+        <w:rPr>
+          <w:color w:val="2C3E50"/>
+          <w:sz w:val="22"/>
+        </w:rPr>
+        <w:t>GPA: 3.9/4.0</w:t>
+      </w:r>
+    </w:p>
+    <w:p>
+      <w:pPr>
+        <w:spacing w:after="100"/>
+        <w:ind w:left="144"/>
+      </w:pPr>
+      <w:r>
+        <w:rPr>
+          <w:color w:val="2C3E50"/>
+          <w:sz w:val="22"/>
+        </w:rPr>
+        <w:t>2. Bachelor of Science in Electrical Engineering, Stanford University, 2015</w:t>
+      </w:r>
+    </w:p>
+    <w:p>
+      <w:pPr>
+        <w:spacing w:after="100"/>
+        <w:ind w:left="144"/>
+      </w:pPr>
+      <w:r>
+        <w:rPr>
+          <w:color w:val="2C3E50"/>
+          <w:sz w:val="22"/>
+        </w:rPr>
+        <w:t>GPA: 3.7/4.0</w:t>
+      </w:r>
+    </w:p>
+    <w:p>
+      <w:pPr>
+        <w:spacing w:after="100"/>
+        <w:ind w:left="144"/>
+      </w:pPr>
+      <w:r>
+        <w:rPr>
+          <w:color w:val="2C3E50"/>
+          <w:sz w:val="22"/>
+        </w:rPr>
+        <w:t>3. Associate of Arts in Mathematics, California State University, 2013</w:t>
+      </w:r>
+    </w:p>
+    <w:p>
+      <w:pPr>
+        <w:spacing w:after="100"/>
+        <w:ind w:left="144"/>
+      </w:pPr>
+      <w:r>
+        <w:rPr>
+          <w:color w:val="2C3E50"/>
+          <w:sz w:val="22"/>
+        </w:rPr>
+        <w:t>GPA: 3.8/4.0</w:t>
       </w:r>
     </w:p>
     <w:p/>
     <w:p>
       <w:pPr>
-        <w:pStyle w:val="Heading1"/>
         <w:spacing w:before="240" w:after="120"/>
       </w:pPr>
       <w:r>
-        <w:t>Education</w:t>
+        <w:rPr>
+          <w:b/>
+          <w:color w:val="1A237E"/>
+          <w:sz w:val="24"/>
+        </w:rPr>
+        <w:t>SKILLS</w:t>
       </w:r>
     </w:p>
     <w:p>
       <w:pPr>
-        <w:spacing w:after="120"/>
+        <w:spacing w:after="160"/>
+        <w:jc w:val="left"/>
       </w:pPr>
       <w:r>
-        <w:t>Samrat Nayak has a B.A. degree from George Washington University and an M.A. degree from the University of Maryland.</w:t>
+        <w:rPr>
+          <w:color w:val="1A237E"/>
+          <w:sz w:val="18"/>
+        </w:rPr>
+        <w:t>__________________________________________________</w:t>
+      </w:r>
+    </w:p>
+    <w:p>
+      <w:pPr>
+        <w:spacing w:after="100"/>
+        <w:ind w:left="144"/>
+      </w:pPr>
+      <w:r>
+        <w:rPr>
+          <w:color w:val="2C3E50"/>
+          <w:sz w:val="22"/>
+        </w:rPr>
+        <w:t>Software Development: Java, Python, C++ | Web Development: HTML, CSS, JavaScript, React.js | Databases: MySQL, MongoDB, PostgreSQL | Agile Methodologies, Scrum | Cloud Computing: AWS, Google Cloud Platform | Version Control: Git, SVN | Data Structures and Algorithms | Machine Learning: TensorFlow, PyTorch</w:t>
+      </w:r>
+    </w:p>
+    <w:p>
+      <w:pPr>
+        <w:spacing w:after="100"/>
+        <w:ind w:left="144"/>
+      </w:pPr>
+      <w:r>
+        <w:rPr>
+          <w:color w:val="2C3E50"/>
+          <w:sz w:val="22"/>
+        </w:rPr>
+        <w:t>Project Management: PMP Certified, Microsoft Project, Asana, Trello | Communication: Fluent English, Presentation Skills | Leadership: Team Building, Conflict Resolution | Problem-Solving, Critical Thinking | Time Management, Organizational Skills | Adaptability, Collaboration | Customer Service: Zendesk, Salesforce | Microsoft Office Suite (Word, Excel, PowerPoint)</w:t>
       </w:r>
     </w:p>
     <w:p/>
     <w:p>
       <w:pPr>
-        <w:pStyle w:val="Heading1"/>
         <w:spacing w:before="240" w:after="120"/>
       </w:pPr>
       <w:r>
-        <w:t>Skills</w:t>
+        <w:rPr>
+          <w:b/>
+          <w:color w:val="1A237E"/>
+          <w:sz w:val="24"/>
+        </w:rPr>
+        <w:t>CERTIFICATIONS</w:t>
       </w:r>
     </w:p>
     <w:p>
       <w:pPr>
-        <w:spacing w:after="120"/>
+        <w:spacing w:after="160"/>
+        <w:jc w:val="left"/>
       </w:pPr>
       <w:r>
-        <w:t>strong&gt;Skilled at /strong&gt; Java programming language with SOLID knowledge</w:t>
+        <w:rPr>
+          <w:color w:val="1A237E"/>
+          <w:sz w:val="18"/>
+        </w:rPr>
+        <w:t>__________________________________________________</w:t>
+      </w:r>
+    </w:p>
+    <w:p>
+      <w:pPr>
+        <w:spacing w:after="100"/>
+        <w:ind w:left="144"/>
+      </w:pPr>
+      <w:r>
+        <w:rPr>
+          <w:color w:val="2C3E50"/>
+          <w:sz w:val="22"/>
+        </w:rPr>
+        <w:t>Certification Name: Project Management Professional (PMP) - Project Management Institute (PMI), (Year)</w:t>
+      </w:r>
+    </w:p>
+    <w:p>
+      <w:pPr>
+        <w:spacing w:after="100"/>
+        <w:ind w:left="144"/>
+      </w:pPr>
+      <w:r>
+        <w:rPr>
+          <w:color w:val="2C3E50"/>
+          <w:sz w:val="22"/>
+        </w:rPr>
+        <w:t>Certification Name: Certified Information Systems Security Professional (CISSP) - International Information System Security Certification Consortium (ISC)², (Year)</w:t>
+      </w:r>
+    </w:p>
+    <w:p>
+      <w:pPr>
+        <w:spacing w:after="100"/>
+        <w:ind w:left="144"/>
+      </w:pPr>
+      <w:r>
+        <w:rPr>
+          <w:color w:val="2C3E50"/>
+          <w:sz w:val="22"/>
+        </w:rPr>
+        <w:t>Certification Name: ITIL Foundation - Axelos, (Year)</w:t>
+      </w:r>
+    </w:p>
+    <w:p>
+      <w:pPr>
+        <w:spacing w:after="100"/>
+        <w:ind w:left="144"/>
+      </w:pPr>
+      <w:r>
+        <w:rPr>
+          <w:color w:val="2C3E50"/>
+          <w:sz w:val="22"/>
+        </w:rPr>
+        <w:t>Certification Name: Six Sigma Green Belt - American Society for Quality (ASQ), (Year)</w:t>
+      </w:r>
+    </w:p>
+    <w:p>
+      <w:pPr>
+        <w:spacing w:after="100"/>
+        <w:ind w:left="144"/>
+      </w:pPr>
+      <w:r>
+        <w:rPr>
+          <w:color w:val="2C3E50"/>
+          <w:sz w:val="22"/>
+        </w:rPr>
+        <w:t>Certification Name: Microsoft Certified: Azure DevOps Engineer Expert - Microsoft Corporation, (Year)</w:t>
+      </w:r>
+    </w:p>
+    <w:p>
+      <w:pPr>
+        <w:spacing w:after="100"/>
+        <w:ind w:left="144"/>
+      </w:pPr>
+      <w:r>
+        <w:rPr>
+          <w:color w:val="2C3E50"/>
+          <w:sz w:val="22"/>
+        </w:rPr>
+        <w:t>Certification Name: AWS Certified Solutions Architect - Professional - Amazon Web Services (AWS), (Year)</w:t>
+      </w:r>
+    </w:p>
+    <w:p>
+      <w:pPr>
+        <w:spacing w:after="100"/>
+        <w:ind w:left="144"/>
+      </w:pPr>
+      <w:r>
+        <w:rPr>
+          <w:color w:val="2C3E50"/>
+          <w:sz w:val="22"/>
+        </w:rPr>
+        <w:t>Certification Name: Certified Scrum Master (CSM) - Scrum Alliance, (Year)</w:t>
       </w:r>
     </w:p>
     <w:p/>
     <w:p>
       <w:pPr>
-        <w:pStyle w:val="Heading1"/>
         <w:spacing w:before="240" w:after="120"/>
       </w:pPr>
       <w:r>
-        <w:t>Certifications</w:t>
+        <w:rPr>
+          <w:b/>
+          <w:color w:val="1A237E"/>
+          <w:sz w:val="24"/>
+        </w:rPr>
+        <w:t>PROJECTS</w:t>
       </w:r>
     </w:p>
     <w:p>
       <w:pPr>
-        <w:spacing w:after="120"/>
+        <w:spacing w:after="160"/>
+        <w:jc w:val="left"/>
       </w:pPr>
       <w:r>
-        <w:t>Samrat Nayak has a Master's degree in Business Administration and is a certified professional accountant.</w:t>
+        <w:rPr>
+          <w:color w:val="1A237E"/>
+          <w:sz w:val="18"/>
+        </w:rPr>
+        <w:t>__________________________________________________</w:t>
+      </w:r>
+    </w:p>
+    <w:p>
+      <w:pPr>
+        <w:spacing w:after="100"/>
+        <w:ind w:left="144"/>
+      </w:pPr>
+      <w:r>
+        <w:rPr>
+          <w:color w:val="2C3E50"/>
+          <w:sz w:val="22"/>
+        </w:rPr>
+        <w:t>1. Smart Home Automation System</w:t>
+      </w:r>
+    </w:p>
+    <w:p>
+      <w:pPr>
+        <w:pStyle w:val="ListBullet"/>
+        <w:spacing w:after="80"/>
+        <w:ind w:left="360" w:hanging="360"/>
+      </w:pPr>
+      <w:r>
+        <w:rPr>
+          <w:color w:val="2C3E50"/>
+          <w:sz w:val="20"/>
+        </w:rPr>
+        <w:t>Developed an IoT-based home automation system using Raspberry Pi, Node-RED, and MQTT. Improved energy efficiency by 20%.</w:t>
+      </w:r>
+    </w:p>
+    <w:p>
+      <w:pPr>
+        <w:spacing w:after="100"/>
+        <w:ind w:left="144"/>
+      </w:pPr>
+      <w:r>
+        <w:rPr>
+          <w:color w:val="2C3E50"/>
+          <w:sz w:val="22"/>
+        </w:rPr>
+        <w:t>2. E-commerce Web Application (ECA)</w:t>
+      </w:r>
+    </w:p>
+    <w:p>
+      <w:pPr>
+        <w:pStyle w:val="ListBullet"/>
+        <w:spacing w:after="80"/>
+        <w:ind w:left="360" w:hanging="360"/>
+      </w:pPr>
+      <w:r>
+        <w:rPr>
+          <w:color w:val="2C3E50"/>
+          <w:sz w:val="20"/>
+        </w:rPr>
+        <w:t>Designed and implemented a scalable e-commerce web application using ReactJS, Django, and PostgreSQL. Increased sales by 35%.</w:t>
+      </w:r>
+    </w:p>
+    <w:p>
+      <w:pPr>
+        <w:spacing w:after="100"/>
+        <w:ind w:left="144"/>
+      </w:pPr>
+      <w:r>
+        <w:rPr>
+          <w:color w:val="2C3E50"/>
+          <w:sz w:val="22"/>
+        </w:rPr>
+        <w:t>3. Predictive Maintenance System</w:t>
+      </w:r>
+    </w:p>
+    <w:p>
+      <w:pPr>
+        <w:pStyle w:val="ListBullet"/>
+        <w:spacing w:after="80"/>
+        <w:ind w:left="360" w:hanging="360"/>
+      </w:pPr>
+      <w:r>
+        <w:rPr>
+          <w:color w:val="2C3E50"/>
+          <w:sz w:val="20"/>
+        </w:rPr>
+        <w:t>Built a predictive maintenance system using machine learning algorithms (PyTorch) and IoT devices (Arduino). Reduced equipment downtime by 40%.</w:t>
+      </w:r>
+    </w:p>
+    <w:p>
+      <w:pPr>
+        <w:spacing w:after="100"/>
+        <w:ind w:left="144"/>
+      </w:pPr>
+      <w:r>
+        <w:rPr>
+          <w:color w:val="2C3E50"/>
+          <w:sz w:val="22"/>
+        </w:rPr>
+        <w:t>Contact Information:</w:t>
+      </w:r>
+    </w:p>
+    <w:p>
+      <w:pPr>
+        <w:spacing w:after="100"/>
+        <w:ind w:left="144"/>
+      </w:pPr>
+      <w:r>
+        <w:rPr>
+          <w:color w:val="2C3E50"/>
+          <w:sz w:val="22"/>
+        </w:rPr>
+        <w:t>Email: john.doe@email.com</w:t>
+      </w:r>
+    </w:p>
+    <w:p>
+      <w:pPr>
+        <w:spacing w:after="100"/>
+        <w:ind w:left="144"/>
+      </w:pPr>
+      <w:r>
+        <w:rPr>
+          <w:color w:val="2C3E50"/>
+          <w:sz w:val="22"/>
+        </w:rPr>
+        <w:t>Phone: +1-555-123-4567</w:t>
       </w:r>
     </w:p>
     <w:p/>
     <w:p>
       <w:pPr>
-        <w:pStyle w:val="Heading1"/>
         <w:spacing w:before="240" w:after="120"/>
       </w:pPr>
       <w:r>
-        <w:t>Projects</w:t>
+        <w:rPr>
+          <w:b/>
+          <w:color w:val="1A237E"/>
+          <w:sz w:val="24"/>
+        </w:rPr>
+        <w:t>LANGUAGES</w:t>
       </w:r>
     </w:p>
     <w:p>
       <w:pPr>
-        <w:spacing w:after="120"/>
+        <w:spacing w:after="160"/>
+        <w:jc w:val="left"/>
       </w:pPr>
       <w:r>
-        <w:t>Samrat Nayak is a Senior Analyst with over 8 years of experience in the financial industry.</w:t>
-      </w:r>
-    </w:p>
-    <w:p/>
-    <w:p>
-      <w:pPr>
-        <w:pStyle w:val="Heading1"/>
-        <w:spacing w:before="240" w:after="120"/>
-      </w:pPr>
-      <w:r>
-        <w:t>Languages</w:t>
+        <w:rPr>
+          <w:color w:val="1A237E"/>
+          <w:sz w:val="18"/>
+        </w:rPr>
+        <w:t>__________________________________________________</w:t>
       </w:r>
     </w:p>
     <w:p>
       <w:pPr>
-        <w:spacing w:after="120"/>
+        <w:spacing w:after="100"/>
+        <w:ind w:left="144"/>
       </w:pPr>
       <w:r>
-        <w:t>English, Java, SOLID, CP</w:t>
+        <w:rPr>
+          <w:color w:val="2C3E50"/>
+          <w:sz w:val="22"/>
+        </w:rPr>
+        <w:t>Proficient in English (native). Fluent in Spanish (C2 level). Basic knowledge of French and German.</w:t>
+      </w:r>
+    </w:p>
+    <w:p>
+      <w:pPr>
+        <w:spacing w:after="100"/>
+        <w:ind w:left="144"/>
+      </w:pPr>
+      <w:r>
+        <w:rPr>
+          <w:color w:val="2C3E50"/>
+          <w:sz w:val="22"/>
+        </w:rPr>
+        <w:t>Contact Information:</w:t>
+      </w:r>
+    </w:p>
+    <w:p>
+      <w:pPr>
+        <w:spacing w:after="100"/>
+        <w:ind w:left="144"/>
+      </w:pPr>
+      <w:r>
+        <w:rPr>
+          <w:color w:val="2C3E50"/>
+          <w:sz w:val="22"/>
+        </w:rPr>
+        <w:t>email: john.doe@email.com</w:t>
+      </w:r>
+    </w:p>
+    <w:p>
+      <w:pPr>
+        <w:spacing w:after="100"/>
+        <w:ind w:left="144"/>
+      </w:pPr>
+      <w:r>
+        <w:rPr>
+          <w:color w:val="2C3E50"/>
+          <w:sz w:val="22"/>
+        </w:rPr>
+        <w:t>phone: +1-555-123-4567</w:t>
       </w:r>
     </w:p>
     <w:p/>
     <w:sectPr>
       <w:pgSz w:w="12240" w:h="15840"/>
-      <w:pgMar w:top="720" w:right="1080" w:bottom="720" w:left="1080" w:header="720" w:footer="720" w:gutter="0"/>
+      <w:pgMar w:top="720" w:right="1008" w:bottom="720" w:left="1008" w:header="720" w:footer="720" w:gutter="0"/>
       <w:cols w:space="720"/>
       <w:docGrid w:linePitch="360"/>
     </w:sectPr>

</xml_diff>